<commit_message>
finalización del acta de entrega y el de recepción a medias
</commit_message>
<xml_diff>
--- a/plantillas/recepcion.docx
+++ b/plantillas/recepcion.docx
@@ -41,7 +41,27 @@
         <w:rPr>
           <w:rFonts w:eastAsia="Arial" w:cs="Calibri"/>
         </w:rPr>
-        <w:t xml:space="preserve"> se suscribe la presente acta de constatación física y entrega recepción de Bienes de Usuario Final entre la </w:t>
+        <w:t xml:space="preserve"> se su</w:t>
+      </w:r>
+      <w:bookmarkStart w:id="1" w:name="_GoBack"/>
+      <w:bookmarkEnd w:id="1"/>
+      <w:r>
+        <w:rPr>
+          <w:rFonts w:eastAsia="Arial" w:cs="Calibri"/>
+        </w:rPr>
+        <w:t>scribe la presente acta de constatación física y entrega recepción de Bienes de Usuario Final entre la</w:t>
+      </w:r>
+      <w:r>
+        <w:rPr>
+          <w:rFonts w:eastAsia="Arial" w:cs="Calibri"/>
+        </w:rPr>
+        <w:t>/el</w:t>
+      </w:r>
+      <w:r>
+        <w:rPr>
+          <w:rFonts w:eastAsia="Arial" w:cs="Calibri"/>
+        </w:rPr>
+        <w:t xml:space="preserve"> </w:t>
       </w:r>
       <w:r>
         <w:rPr>
@@ -105,7 +125,13 @@
         </w:rPr>
         <w:t>la</w:t>
       </w:r>
-      <w:bookmarkStart w:id="1" w:name="_Hlk188454914"/>
+      <w:bookmarkStart w:id="2" w:name="_Hlk188454914"/>
+      <w:r>
+        <w:rPr>
+          <w:rFonts w:eastAsia="Arial" w:cs="Calibri"/>
+        </w:rPr>
+        <w:t>/el</w:t>
+      </w:r>
       <w:r>
         <w:rPr>
           <w:rFonts w:eastAsia="Arial" w:cs="Calibri"/>
@@ -165,7 +191,7 @@
         <w:t xml:space="preserve"> de la Facultad de Jurisprudencia, Ciencias Sociales y Políticas de la Universidad de Guayaquil.</w:t>
       </w:r>
     </w:p>
-    <w:bookmarkEnd w:id="1"/>
+    <w:bookmarkEnd w:id="2"/>
     <w:p>
       <w:pPr>
         <w:jc w:val="both"/>
@@ -198,7 +224,13 @@
         <w:rPr>
           <w:rFonts w:eastAsia="Arial" w:cs="Calibri"/>
         </w:rPr>
-        <w:t>acción_personal</w:t>
+        <w:t>accio</w:t>
+      </w:r>
+      <w:r>
+        <w:rPr>
+          <w:rFonts w:eastAsia="Arial" w:cs="Calibri"/>
+        </w:rPr>
+        <w:t>n_personal</w:t>
       </w:r>
       <w:proofErr w:type="spellEnd"/>
       <w:r>
@@ -211,13 +243,59 @@
         <w:rPr>
           <w:rFonts w:eastAsia="Arial" w:cs="Calibri"/>
         </w:rPr>
-        <w:t xml:space="preserve"> la Econ. Jenny María Ortega Mazón,</w:t>
-      </w:r>
-      <w:r>
-        <w:rPr>
-          <w:rFonts w:eastAsia="Arial" w:cs="Calibri"/>
-        </w:rPr>
-        <w:t xml:space="preserve"> Administrador (e) de la Facultad de Jurisprudencia, Ciencias Sociales y Políticas de la Universidad</w:t>
+        <w:t xml:space="preserve"> la</w:t>
+      </w:r>
+      <w:r>
+        <w:rPr>
+          <w:rFonts w:eastAsia="Arial" w:cs="Calibri"/>
+        </w:rPr>
+        <w:t>/el {{</w:t>
+      </w:r>
+      <w:proofErr w:type="spellStart"/>
+      <w:r>
+        <w:rPr>
+          <w:rFonts w:eastAsia="Arial" w:cs="Calibri"/>
+        </w:rPr>
+        <w:t>recibido_por</w:t>
+      </w:r>
+      <w:proofErr w:type="spellEnd"/>
+      <w:r>
+        <w:rPr>
+          <w:rFonts w:eastAsia="Arial" w:cs="Calibri"/>
+        </w:rPr>
+        <w:t>}}</w:t>
+      </w:r>
+      <w:r>
+        <w:rPr>
+          <w:rFonts w:eastAsia="Arial" w:cs="Calibri"/>
+        </w:rPr>
+        <w:t>,</w:t>
+      </w:r>
+      <w:r>
+        <w:rPr>
+          <w:rFonts w:eastAsia="Arial" w:cs="Calibri"/>
+        </w:rPr>
+        <w:t xml:space="preserve"> {{</w:t>
+      </w:r>
+      <w:proofErr w:type="spellStart"/>
+      <w:r>
+        <w:rPr>
+          <w:rFonts w:eastAsia="Arial" w:cs="Calibri"/>
+        </w:rPr>
+        <w:t>rol_recibe</w:t>
+      </w:r>
+      <w:proofErr w:type="spellEnd"/>
+      <w:r>
+        <w:rPr>
+          <w:rFonts w:eastAsia="Arial" w:cs="Calibri"/>
+        </w:rPr>
+        <w:t>}}</w:t>
+      </w:r>
+      <w:r>
+        <w:rPr>
+          <w:rFonts w:eastAsia="Arial" w:cs="Calibri"/>
+        </w:rPr>
+        <w:t xml:space="preserve"> (e) de la Facultad de Jurisprudencia, Ciencias Sociales y Políticas de la Universidad</w:t>
       </w:r>
       <w:r>
         <w:rPr>
@@ -289,7 +367,13 @@
         <w:rPr>
           <w:rFonts w:eastAsia="Arial" w:cs="Calibri"/>
         </w:rPr>
-        <w:t xml:space="preserve"> se delegó a las Ing. </w:t>
+        <w:t xml:space="preserve"> se delegó a</w:t>
+      </w:r>
+      <w:r>
+        <w:rPr>
+          <w:rFonts w:eastAsia="Arial" w:cs="Calibri"/>
+        </w:rPr>
+        <w:t xml:space="preserve"> </w:t>
       </w:r>
       <w:r>
         <w:rPr>
@@ -411,15 +495,7 @@
           <w:b/>
           <w:bCs/>
         </w:rPr>
-        <w:t xml:space="preserve">SEGUNDA. </w:t>
-      </w:r>
-      <w:r>
-        <w:rPr>
-          <w:rFonts w:eastAsia="Arial" w:cs="Calibri"/>
-          <w:b/>
-          <w:bCs/>
-        </w:rPr>
-        <w:t xml:space="preserve">- BASE LEGAL. – </w:t>
+        <w:t xml:space="preserve">SEGUNDA. - BASE LEGAL. – </w:t>
       </w:r>
     </w:p>
     <w:p>
@@ -461,19 +537,7 @@
         <w:rPr>
           <w:rFonts w:eastAsia="Arial" w:cs="Calibri"/>
         </w:rPr>
-        <w:t>- Este Reglamento rige p</w:t>
-      </w:r>
-      <w:r>
-        <w:rPr>
-          <w:rFonts w:eastAsia="Arial" w:cs="Calibri"/>
-        </w:rPr>
-        <w:t>ara todos los servidores/as y las personas que, en cualquier forma o a cualquier título, trabajen, presten servicios o ejerzan un cargo, función o dignidad en el sector público; así como para las personas jurídicas de derecho privado que dispongan de recur</w:t>
-      </w:r>
-      <w:r>
-        <w:rPr>
-          <w:rFonts w:eastAsia="Arial" w:cs="Calibri"/>
-        </w:rPr>
-        <w:t>sos públicos, de conformidad a lo señalado en la Ley Orgánica de la Contraloría General del Estado, en lo que fuere aplicable, a cuyo cargo se encuentre la administración, custodia, uso y cuidado de los bienes e inventarios del Estado.</w:t>
+        <w:t>- Este Reglamento rige para todos los servidores/as y las personas que, en cualquier forma o a cualquier título, trabajen, presten servicios o ejerzan un cargo, función o dignidad en el sector público; así como para las personas jurídicas de derecho privado que dispongan de recursos públicos, de conformidad a lo señalado en la Ley Orgánica de la Contraloría General del Estado, en lo que fuere aplicable, a cuyo cargo se encuentre la administración, custodia, uso y cuidado de los bienes e inventarios del Estado.</w:t>
       </w:r>
     </w:p>
     <w:p>
@@ -487,13 +551,7 @@
         <w:rPr>
           <w:rFonts w:eastAsia="Arial" w:cs="Calibri"/>
         </w:rPr>
-        <w:t xml:space="preserve">Por tanto, no habrá </w:t>
-      </w:r>
-      <w:r>
-        <w:rPr>
-          <w:rFonts w:eastAsia="Arial" w:cs="Calibri"/>
-        </w:rPr>
-        <w:t>servidor/a o persona alguna que por razón de su cargo, función o jerarquía se encuentre exento/a del cumplimiento de las disposiciones del presente Reglamento de conformidad a lo previsto en el artículo 233 de la Constitución de la República del Ecuador.</w:t>
+        <w:t>Por tanto, no habrá servidor/a o persona alguna que por razón de su cargo, función o jerarquía se encuentre exento/a del cumplimiento de las disposiciones del presente Reglamento de conformidad a lo previsto en el artículo 233 de la Constitución de la República del Ecuador.</w:t>
       </w:r>
     </w:p>
     <w:p>
@@ -507,13 +565,7 @@
         <w:rPr>
           <w:rFonts w:eastAsia="Arial" w:cs="Calibri"/>
         </w:rPr>
-        <w:t>A</w:t>
-      </w:r>
-      <w:r>
-        <w:rPr>
-          <w:rFonts w:eastAsia="Arial" w:cs="Calibri"/>
-        </w:rPr>
-        <w:t xml:space="preserve">rtículo 19.- </w:t>
+        <w:t xml:space="preserve">Artículo 19.- </w:t>
       </w:r>
       <w:r>
         <w:rPr>
@@ -555,13 +607,7 @@
         <w:rPr>
           <w:rFonts w:eastAsia="Arial" w:cs="Calibri"/>
         </w:rPr>
-        <w:t>l. - Será el responsable del cuidado, buen uso, custodia y conservación de los bienes e inventarios a él asignados para el desempeño de sus funciones y los que por delegación expresa se agreguen a su cuidado, conforme a las dispos</w:t>
-      </w:r>
-      <w:r>
-        <w:rPr>
-          <w:rFonts w:eastAsia="Arial" w:cs="Calibri"/>
-        </w:rPr>
-        <w:t>iciones legales y reglamentarias correspondientes.</w:t>
+        <w:t>l. - Será el responsable del cuidado, buen uso, custodia y conservación de los bienes e inventarios a él asignados para el desempeño de sus funciones y los que por delegación expresa se agreguen a su cuidado, conforme a las disposiciones legales y reglamentarias correspondientes.</w:t>
       </w:r>
     </w:p>
     <w:p>
@@ -589,13 +635,7 @@
         <w:rPr>
           <w:rFonts w:eastAsia="Arial" w:cs="Calibri"/>
         </w:rPr>
-        <w:t xml:space="preserve">a) Dejar constancia obligatoria en un acta de entrega recepción el momento en que se efectúa la entrega de bienes por parte del Proveedor al Guardalmacén, o quien haga sus veces, con el fin </w:t>
-      </w:r>
-      <w:r>
-        <w:rPr>
-          <w:rFonts w:eastAsia="Arial" w:cs="Calibri"/>
-        </w:rPr>
-        <w:t>de controlar, registrar y custodiar los bienes entregados.</w:t>
+        <w:t>a) Dejar constancia obligatoria en un acta de entrega recepción el momento en que se efectúa la entrega de bienes por parte del Proveedor al Guardalmacén, o quien haga sus veces, con el fin de controlar, registrar y custodiar los bienes entregados.</w:t>
       </w:r>
     </w:p>
     <w:p>
@@ -610,13 +650,7 @@
           <w:rFonts w:eastAsia="Arial" w:cs="Calibri"/>
         </w:rPr>
         <w:lastRenderedPageBreak/>
-        <w:t>b) El Guardalmacén, o quien haga sus veces entregará los registros de bienes y/o inventarios al titular de cada área, para, su control y custodia; y, una copia de los mismos los entregará al Custod</w:t>
-      </w:r>
-      <w:r>
-        <w:rPr>
-          <w:rFonts w:eastAsia="Arial" w:cs="Calibri"/>
-        </w:rPr>
-        <w:t>io Administrativo del área.</w:t>
+        <w:t>b) El Guardalmacén, o quien haga sus veces entregará los registros de bienes y/o inventarios al titular de cada área, para, su control y custodia; y, una copia de los mismos los entregará al Custodio Administrativo del área.</w:t>
       </w:r>
       <w:bookmarkEnd w:id="0"/>
     </w:p>
@@ -626,20 +660,13 @@
           <w:rFonts w:cs="Calibri"/>
         </w:rPr>
       </w:pPr>
-      <w:bookmarkStart w:id="2" w:name="_Hlk192598698"/>
+      <w:bookmarkStart w:id="3" w:name="_Hlk192598698"/>
       <w:r>
         <w:rPr>
           <w:rFonts w:cs="Calibri"/>
           <w:color w:val="000000" w:themeColor="text1"/>
         </w:rPr>
-        <w:t xml:space="preserve">c) El Guardalmacén, o quien haga sus veces, entregará al Custodio Administrativo o al Usuario Final los bienes necesarios para las labores inherentes a su cargo o función, de lo cual levantará un acta de entrega recepción en la </w:t>
-      </w:r>
-      <w:r>
-        <w:rPr>
-          <w:rFonts w:cs="Calibri"/>
-          <w:color w:val="000000" w:themeColor="text1"/>
-        </w:rPr>
-        <w:t>que constarán las especificaciones y características de aquellos.</w:t>
+        <w:t>c) El Guardalmacén, o quien haga sus veces, entregará al Custodio Administrativo o al Usuario Final los bienes necesarios para las labores inherentes a su cargo o función, de lo cual levantará un acta de entrega recepción en la que constarán las especificaciones y características de aquellos.</w:t>
       </w:r>
     </w:p>
     <w:p>
@@ -659,14 +686,7 @@
           <w:rFonts w:cs="Calibri"/>
           <w:color w:val="000000" w:themeColor="text1"/>
         </w:rPr>
-        <w:t>d) Cuando se produzca la renuncia, separación, destitución, comisión de servicios o traslado administrativo de un Usuario Final se realizará la entrega recepción de los bienes asignados a és</w:t>
-      </w:r>
-      <w:r>
-        <w:rPr>
-          <w:rFonts w:cs="Calibri"/>
-          <w:color w:val="000000" w:themeColor="text1"/>
-        </w:rPr>
-        <w:t>te al Custodio Administrativo de la unidad.</w:t>
+        <w:t>d) Cuando se produzca la renuncia, separación, destitución, comisión de servicios o traslado administrativo de un Usuario Final se realizará la entrega recepción de los bienes asignados a éste al Custodio Administrativo de la unidad.</w:t>
       </w:r>
     </w:p>
     <w:p>
@@ -757,13 +777,7 @@
         <w:rPr>
           <w:rFonts w:cs="Calibri"/>
         </w:rPr>
-        <w:t>de la Facultad, y q</w:t>
-      </w:r>
-      <w:r>
-        <w:rPr>
-          <w:rFonts w:cs="Calibri"/>
-        </w:rPr>
-        <w:t>ue son entregados a l</w:t>
+        <w:t>de la Facultad, y que son entregados a l</w:t>
       </w:r>
       <w:r>
         <w:rPr>
@@ -893,18 +907,7 @@
           <w:sz w:val="20"/>
           <w:szCs w:val="20"/>
         </w:rPr>
-        <w:t>_din</w:t>
-      </w:r>
-      <w:bookmarkStart w:id="3" w:name="_GoBack"/>
-      <w:bookmarkEnd w:id="3"/>
-      <w:r>
-        <w:rPr>
-          <w:rFonts w:ascii="Arial" w:hAnsi="Arial" w:cs="Arial"/>
-          <w:bCs/>
-          <w:sz w:val="20"/>
-          <w:szCs w:val="20"/>
-        </w:rPr>
-        <w:t>amica</w:t>
+        <w:t>_dinamica</w:t>
       </w:r>
       <w:proofErr w:type="spellEnd"/>
       <w:r>
@@ -968,15 +971,7 @@
           <w:sz w:val="20"/>
           <w:szCs w:val="20"/>
         </w:rPr>
-        <w:t>, no es posible registrar los valores de los bienes antes descritos, cabe indicar que se</w:t>
-      </w:r>
-      <w:r>
-        <w:rPr>
-          <w:rFonts w:ascii="Arial" w:hAnsi="Arial" w:cs="Arial"/>
-          <w:sz w:val="20"/>
-          <w:szCs w:val="20"/>
-        </w:rPr>
-        <w:t xml:space="preserve"> está realizando el levantamiento para la conciliación de todos los bienes y luego la codificación y valoración de los mismos.</w:t>
+        <w:t>, no es posible registrar los valores de los bienes antes descritos, cabe indicar que se está realizando el levantamiento para la conciliación de todos los bienes y luego la codificación y valoración de los mismos.</w:t>
       </w:r>
     </w:p>
     <w:p>
@@ -1030,17 +1025,7 @@
           <w:sz w:val="20"/>
           <w:szCs w:val="20"/>
         </w:rPr>
-        <w:t>SEXTA. - ACEPTACI</w:t>
-      </w:r>
-      <w:r>
-        <w:rPr>
-          <w:rFonts w:ascii="Arial" w:hAnsi="Arial" w:cs="Arial"/>
-          <w:b/>
-          <w:bCs/>
-          <w:sz w:val="20"/>
-          <w:szCs w:val="20"/>
-        </w:rPr>
-        <w:t>ÓN</w:t>
+        <w:t>SEXTA. - ACEPTACIÓN</w:t>
       </w:r>
       <w:r>
         <w:rPr>
@@ -1438,7 +1423,7 @@
           </w:p>
         </w:tc>
       </w:tr>
-      <w:bookmarkEnd w:id="2"/>
+      <w:bookmarkEnd w:id="3"/>
     </w:tbl>
     <w:p>
       <w:pPr>
@@ -1606,7 +1591,7 @@
         <w:sz w:val="24"/>
         <w:szCs w:val="24"/>
       </w:rPr>
-      <w:t>2</w:t>
+      <w:t>1</w:t>
     </w:r>
     <w:r>
       <w:rPr>
@@ -1890,23 +1875,25 @@
                               <w:b/>
                               <w:color w:val="000000"/>
                             </w:rPr>
-                            <w:t>ACTA No. 0</w:t>
+                            <w:t>ACTA No. {{</w:t>
                           </w:r>
+                          <w:proofErr w:type="spellStart"/>
                           <w:r>
                             <w:rPr>
                               <w:rFonts w:eastAsia="Calibri" w:cs="Calibri"/>
                               <w:b/>
                               <w:color w:val="000000"/>
                             </w:rPr>
-                            <w:t>01</w:t>
+                            <w:t>numero_acta</w:t>
                           </w:r>
+                          <w:proofErr w:type="spellEnd"/>
                           <w:r>
                             <w:rPr>
                               <w:rFonts w:eastAsia="Calibri" w:cs="Calibri"/>
                               <w:b/>
                               <w:color w:val="000000"/>
                             </w:rPr>
-                            <w:t>-2024</w:t>
+                            <w:t>}}</w:t>
                           </w:r>
                         </w:p>
                         <w:p>
@@ -2164,9 +2151,9 @@
             </wp:anchor>
           </w:drawing>
         </mc:Choice>
-        <mc:Fallback xmlns:w16sdtfl="http://schemas.microsoft.com/office/word/2024/wordml/sdtformatlock" xmlns:w16sdtdh="http://schemas.microsoft.com/office/word/2020/wordml/sdtdatahash" xmlns:w16du="http://schemas.microsoft.com/office/word/2023/wordml/word16du" xmlns:w16="http://schemas.microsoft.com/office/word/2018/wordml" xmlns:w16cid="http://schemas.microsoft.com/office/word/2016/wordml/cid" xmlns:w16cex="http://schemas.microsoft.com/office/word/2018/wordml/cex" xmlns:oel="http://schemas.microsoft.com/office/2019/extlst" xmlns:am3d="http://schemas.microsoft.com/office/drawing/2017/model3d" xmlns:aink="http://schemas.microsoft.com/office/drawing/2016/ink" xmlns:cx8="http://schemas.microsoft.com/office/drawing/2016/5/14/chartex" xmlns:cx7="http://schemas.microsoft.com/office/drawing/2016/5/13/chartex" xmlns:cx6="http://schemas.microsoft.com/office/drawing/2016/5/12/chartex" xmlns:cx5="http://schemas.microsoft.com/office/drawing/2016/5/11/chartex" xmlns:cx4="http://schemas.microsoft.com/office/drawing/2016/5/10/chartex" xmlns:cx3="http://schemas.microsoft.com/office/drawing/2016/5/9/chartex" xmlns:cx2="http://schemas.microsoft.com/office/drawing/2015/10/21/chartex" xmlns:cx1="http://schemas.microsoft.com/office/drawing/2015/9/8/chartex">
+        <mc:Fallback>
           <w:pict>
-            <v:roundrect w14:anchorId="13D98B87" id="Rectángulo: esquinas redondeadas 455205224" o:spid="_x0000_s1026" style="position:absolute;margin-left:41.45pt;margin-top:4.55pt;width:421.55pt;height:88.5pt;z-index:251662336;visibility:visible;mso-wrap-style:square;mso-wrap-distance-left:9pt;mso-wrap-distance-top:0;mso-wrap-distance-right:9pt;mso-wrap-distance-bottom:0;mso-position-horizontal:absolute;mso-position-horizontal-relative:text;mso-position-vertical:absolute;mso-position-vertical-relative:text;v-text-anchor:middle" arcsize="10923f" o:gfxdata="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" filled="f" strokecolor="#31538f" strokeweight="1pt">
+            <v:roundrect w14:anchorId="13D98B87" id="Rectángulo: esquinas redondeadas 455205224" o:spid="_x0000_s1026" style="position:absolute;margin-left:41.45pt;margin-top:4.55pt;width:421.55pt;height:88.5pt;z-index:251662336;visibility:visible;mso-wrap-style:square;mso-wrap-distance-left:9pt;mso-wrap-distance-top:0;mso-wrap-distance-right:9pt;mso-wrap-distance-bottom:0;mso-position-horizontal:absolute;mso-position-horizontal-relative:text;mso-position-vertical:absolute;mso-position-vertical-relative:text;v-text-anchor:middle" arcsize="10923f" o:gfxdata="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" filled="f" strokecolor="#31538f" strokeweight="1pt">
               <v:stroke startarrowwidth="narrow" startarrowlength="short" endarrowwidth="narrow" endarrowlength="short" joinstyle="miter"/>
               <v:textbox inset="2.53958mm,1.2694mm,2.53958mm,1.2694mm">
                 <w:txbxContent>
@@ -2186,23 +2173,25 @@
                         <w:b/>
                         <w:color w:val="000000"/>
                       </w:rPr>
-                      <w:t>ACTA No. 0</w:t>
+                      <w:t>ACTA No. {{</w:t>
                     </w:r>
+                    <w:proofErr w:type="spellStart"/>
                     <w:r>
                       <w:rPr>
                         <w:rFonts w:eastAsia="Calibri" w:cs="Calibri"/>
                         <w:b/>
                         <w:color w:val="000000"/>
                       </w:rPr>
-                      <w:t>01</w:t>
+                      <w:t>numero_acta</w:t>
                     </w:r>
+                    <w:proofErr w:type="spellEnd"/>
                     <w:r>
                       <w:rPr>
                         <w:rFonts w:eastAsia="Calibri" w:cs="Calibri"/>
                         <w:b/>
                         <w:color w:val="000000"/>
                       </w:rPr>
-                      <w:t>-2024</w:t>
+                      <w:t>}}</w:t>
                     </w:r>
                   </w:p>
                   <w:p>
@@ -2330,18 +2319,7 @@
                         <w:sz w:val="18"/>
                         <w:szCs w:val="18"/>
                       </w:rPr>
-                      <w:t xml:space="preserve">/EL </w:t>
-                    </w:r>
-                    <w:r>
-                      <w:rPr>
-                        <w:rFonts w:eastAsia="Calibri" w:cs="Calibri"/>
-                        <w:b/>
-                        <w:bCs/>
-                        <w:color w:val="000000"/>
-                        <w:sz w:val="18"/>
-                        <w:szCs w:val="18"/>
-                      </w:rPr>
-                      <w:t>{{</w:t>
+                      <w:t>/EL {{</w:t>
                     </w:r>
                     <w:proofErr w:type="spellStart"/>
                     <w:r>
@@ -4133,7 +4111,7 @@
 </file>
 
 <file path=customXml/itemProps3.xml><?xml version="1.0" encoding="utf-8"?>
-<ds:datastoreItem xmlns:ds="http://schemas.openxmlformats.org/officeDocument/2006/customXml" ds:itemID="{015BCD91-A73D-469C-91B0-F7C2CF212E40}">
+<ds:datastoreItem xmlns:ds="http://schemas.openxmlformats.org/officeDocument/2006/customXml" ds:itemID="{D25CB30A-E7D4-469B-BA84-94968F7331E2}">
   <ds:schemaRefs>
     <ds:schemaRef ds:uri="http://schemas.openxmlformats.org/officeDocument/2006/bibliography"/>
   </ds:schemaRefs>

</xml_diff>